<commit_message>
docs: ground documentation and charts in latest evaluation run (Macro-F1: 0.913, Sarcasm F1: 0.900)
</commit_message>
<xml_diff>
--- a/docs/P098_Formal_Project_Documentation.docx
+++ b/docs/P098_Formal_Project_Documentation.docx
@@ -622,7 +622,7 @@
         <w:rPr>
           <w:rFonts w:ascii="Segoe UI" w:hAnsi="Segoe UI"/>
         </w:rPr>
-        <w:t>The system is optimized for commodity hardware (operating comfortably within 8 GB RAM on multi-core CPUs without requiring dedicated GPUs or recurring cloud API expenditures). Empirical evaluation demonstrates high discriminative precision across all 7 affective classes (Macro-F1: 0.886), robust sarcasm resolution, mean inference latencies under 70 ms, and absolute frontend-to-backend database parity through a persistent SQLite3 audit repository.</w:t>
+        <w:t>The system is optimized for commodity hardware (operating comfortably within 8 GB RAM on multi-core CPUs without requiring dedicated GPUs or recurring cloud API expenditures). Empirical evaluation demonstrates high discriminative precision across all 7 affective classes (Macro-F1: 0.913, Accuracy: 91.4%), robust sarcasm resolution (F1: 0.900, Accuracy: 88.6%), warm single-utterance inference latencies under 70 ms, and absolute frontend-to-backend database parity through a persistent SQLite3 audit repository.</w:t>
       </w:r>
     </w:p>
     <w:p>
@@ -6057,7 +6057,7 @@
                 <w:b/>
                 <w:sz w:val="19"/>
               </w:rPr>
-              <w:t>0.886</w:t>
+              <w:t>0.913</w:t>
             </w:r>
           </w:p>
         </w:tc>
@@ -6172,7 +6172,7 @@
                 <w:b/>
                 <w:sz w:val="19"/>
               </w:rPr>
-              <w:t>88.6%</w:t>
+              <w:t>91.4%</w:t>
             </w:r>
           </w:p>
         </w:tc>
@@ -6290,7 +6290,7 @@
                 <w:b/>
                 <w:sz w:val="19"/>
               </w:rPr>
-              <w:t>0.886</w:t>
+              <w:t>0.913</w:t>
             </w:r>
           </w:p>
         </w:tc>
@@ -6405,7 +6405,7 @@
                 <w:b/>
                 <w:sz w:val="19"/>
               </w:rPr>
-              <w:t>0.857</w:t>
+              <w:t>0.900</w:t>
             </w:r>
           </w:p>
         </w:tc>
@@ -6523,7 +6523,7 @@
                 <w:b/>
                 <w:sz w:val="19"/>
               </w:rPr>
-              <w:t>0.800</w:t>
+              <w:t>0.900</w:t>
             </w:r>
           </w:p>
         </w:tc>
@@ -6638,7 +6638,7 @@
                 <w:b/>
                 <w:sz w:val="19"/>
               </w:rPr>
-              <w:t>0.923</w:t>
+              <w:t>0.900</w:t>
             </w:r>
           </w:p>
         </w:tc>
@@ -6711,7 +6711,7 @@
                 <w:b/>
                 <w:sz w:val="19"/>
               </w:rPr>
-              <w:t>Mean CPU Latency</w:t>
+              <w:t>Warm CPU Latency</w:t>
             </w:r>
           </w:p>
         </w:tc>
@@ -7049,14 +7049,14 @@
         <w:rPr>
           <w:rFonts w:ascii="Segoe UI" w:hAnsi="Segoe UI"/>
         </w:rPr>
-        <w:t xml:space="preserve"> Precision: 0.909 &amp;bull; Recall: 1.000 &amp;bull; </w:t>
+        <w:t xml:space="preserve"> Precision: 1.000 &amp;bull; Recall: 1.000 &amp;bull; </w:t>
       </w:r>
       <w:r>
         <w:rPr>
           <w:rFonts w:ascii="Segoe UI" w:hAnsi="Segoe UI"/>
           <w:b/>
         </w:rPr>
-        <w:t>F1: 0.952</w:t>
+        <w:t>F1: 1.000</w:t>
       </w:r>
     </w:p>
     <w:p>
@@ -7069,20 +7069,20 @@
           <w:rFonts w:ascii="Segoe UI" w:hAnsi="Segoe UI"/>
           <w:b/>
         </w:rPr>
-        <w:t>Anger:</w:t>
-      </w:r>
-      <w:r>
-        <w:rPr>
-          <w:rFonts w:ascii="Segoe UI" w:hAnsi="Segoe UI"/>
-        </w:rPr>
-        <w:t xml:space="preserve"> Precision: 0.880 &amp;bull; Recall: 0.880 &amp;bull; </w:t>
+        <w:t>Fear:</w:t>
+      </w:r>
+      <w:r>
+        <w:rPr>
+          <w:rFonts w:ascii="Segoe UI" w:hAnsi="Segoe UI"/>
+        </w:rPr>
+        <w:t xml:space="preserve"> Precision: 1.000 &amp;bull; Recall: 1.000 &amp;bull; </w:t>
       </w:r>
       <w:r>
         <w:rPr>
           <w:rFonts w:ascii="Segoe UI" w:hAnsi="Segoe UI"/>
           <w:b/>
         </w:rPr>
-        <w:t>F1: 0.880</w:t>
+        <w:t>F1: 1.000</w:t>
       </w:r>
     </w:p>
     <w:p>
@@ -7095,20 +7095,20 @@
           <w:rFonts w:ascii="Segoe UI" w:hAnsi="Segoe UI"/>
           <w:b/>
         </w:rPr>
-        <w:t>Sadness:</w:t>
-      </w:r>
-      <w:r>
-        <w:rPr>
-          <w:rFonts w:ascii="Segoe UI" w:hAnsi="Segoe UI"/>
-        </w:rPr>
-        <w:t xml:space="preserve"> Precision: 0.875 &amp;bull; Recall: 0.875 &amp;bull; </w:t>
+        <w:t>Surprise:</w:t>
+      </w:r>
+      <w:r>
+        <w:rPr>
+          <w:rFonts w:ascii="Segoe UI" w:hAnsi="Segoe UI"/>
+        </w:rPr>
+        <w:t xml:space="preserve"> Precision: 1.000 &amp;bull; Recall: 1.000 &amp;bull; </w:t>
       </w:r>
       <w:r>
         <w:rPr>
           <w:rFonts w:ascii="Segoe UI" w:hAnsi="Segoe UI"/>
           <w:b/>
         </w:rPr>
-        <w:t>F1: 0.875</w:t>
+        <w:t>F1: 1.000</w:t>
       </w:r>
     </w:p>
     <w:p>
@@ -7121,20 +7121,20 @@
           <w:rFonts w:ascii="Segoe UI" w:hAnsi="Segoe UI"/>
           <w:b/>
         </w:rPr>
-        <w:t>Fear:</w:t>
-      </w:r>
-      <w:r>
-        <w:rPr>
-          <w:rFonts w:ascii="Segoe UI" w:hAnsi="Segoe UI"/>
-        </w:rPr>
-        <w:t xml:space="preserve"> Precision: 0.857 &amp;bull; Recall: 0.857 &amp;bull; </w:t>
+        <w:t>Neutral:</w:t>
+      </w:r>
+      <w:r>
+        <w:rPr>
+          <w:rFonts w:ascii="Segoe UI" w:hAnsi="Segoe UI"/>
+        </w:rPr>
+        <w:t xml:space="preserve"> Precision: 1.000 &amp;bull; Recall: 1.000 &amp;bull; </w:t>
       </w:r>
       <w:r>
         <w:rPr>
           <w:rFonts w:ascii="Segoe UI" w:hAnsi="Segoe UI"/>
           <w:b/>
         </w:rPr>
-        <w:t>F1: 0.857</w:t>
+        <w:t>F1: 1.000</w:t>
       </w:r>
     </w:p>
     <w:p>
@@ -7147,20 +7147,20 @@
           <w:rFonts w:ascii="Segoe UI" w:hAnsi="Segoe UI"/>
           <w:b/>
         </w:rPr>
-        <w:t>Disgust:</w:t>
-      </w:r>
-      <w:r>
-        <w:rPr>
-          <w:rFonts w:ascii="Segoe UI" w:hAnsi="Segoe UI"/>
-        </w:rPr>
-        <w:t xml:space="preserve"> Precision: 0.875 &amp;bull; Recall: 0.875 &amp;bull; </w:t>
+        <w:t>Sadness:</w:t>
+      </w:r>
+      <w:r>
+        <w:rPr>
+          <w:rFonts w:ascii="Segoe UI" w:hAnsi="Segoe UI"/>
+        </w:rPr>
+        <w:t xml:space="preserve"> Precision: 1.000 &amp;bull; Recall: 0.800 &amp;bull; </w:t>
       </w:r>
       <w:r>
         <w:rPr>
           <w:rFonts w:ascii="Segoe UI" w:hAnsi="Segoe UI"/>
           <w:b/>
         </w:rPr>
-        <w:t>F1: 0.875</w:t>
+        <w:t>F1: 0.889</w:t>
       </w:r>
     </w:p>
     <w:p>
@@ -7173,20 +7173,20 @@
           <w:rFonts w:ascii="Segoe UI" w:hAnsi="Segoe UI"/>
           <w:b/>
         </w:rPr>
-        <w:t>Surprise:</w:t>
-      </w:r>
-      <w:r>
-        <w:rPr>
-          <w:rFonts w:ascii="Segoe UI" w:hAnsi="Segoe UI"/>
-        </w:rPr>
-        <w:t xml:space="preserve"> Precision: 0.880 &amp;bull; Recall: 0.840 &amp;bull; </w:t>
+        <w:t>Disgust:</w:t>
+      </w:r>
+      <w:r>
+        <w:rPr>
+          <w:rFonts w:ascii="Segoe UI" w:hAnsi="Segoe UI"/>
+        </w:rPr>
+        <w:t xml:space="preserve"> Precision: 0.714 &amp;bull; Recall: 1.000 &amp;bull; </w:t>
       </w:r>
       <w:r>
         <w:rPr>
           <w:rFonts w:ascii="Segoe UI" w:hAnsi="Segoe UI"/>
           <w:b/>
         </w:rPr>
-        <w:t>F1: 0.859</w:t>
+        <w:t>F1: 0.833</w:t>
       </w:r>
     </w:p>
     <w:p>
@@ -7199,20 +7199,20 @@
           <w:rFonts w:ascii="Segoe UI" w:hAnsi="Segoe UI"/>
           <w:b/>
         </w:rPr>
-        <w:t>Neutral:</w:t>
-      </w:r>
-      <w:r>
-        <w:rPr>
-          <w:rFonts w:ascii="Segoe UI" w:hAnsi="Segoe UI"/>
-        </w:rPr>
-        <w:t xml:space="preserve"> Precision: 0.833 &amp;bull; Recall: 0.880 &amp;bull; </w:t>
+        <w:t>Anger:</w:t>
+      </w:r>
+      <w:r>
+        <w:rPr>
+          <w:rFonts w:ascii="Segoe UI" w:hAnsi="Segoe UI"/>
+        </w:rPr>
+        <w:t xml:space="preserve"> Precision: 0.750 &amp;bull; Recall: 0.600 &amp;bull; </w:t>
       </w:r>
       <w:r>
         <w:rPr>
           <w:rFonts w:ascii="Segoe UI" w:hAnsi="Segoe UI"/>
           <w:b/>
         </w:rPr>
-        <w:t>F1: 0.856</w:t>
+        <w:t>F1: 0.667</w:t>
       </w:r>
     </w:p>
     <w:p>

</xml_diff>